<commit_message>
0.5 - tools/volcar_lo.py: volcado de referencia del corpus por UNO; corpus en en-US
Claude-Session: https://claude.ai/code/session_014nGJQXvTkbMhTYikVkHfor
</commit_message>
<xml_diff>
--- a/tests/ficheros/write/estructura.docx
+++ b/tests/ficheros/write/estructura.docx
@@ -1064,7 +1064,7 @@
         <w:kern w:val="2"/>
         <w:sz w:val="24"/>
         <w:szCs w:val="24"/>
-        <w:lang w:val="es-ES" w:eastAsia="zh-CN" w:bidi="hi-IN"/>
+        <w:lang w:val="en-US" w:eastAsia="zh-CN" w:bidi="hi-IN"/>
       </w:rPr>
     </w:rPrDefault>
     <w:pPrDefault>
@@ -1086,7 +1086,7 @@
       <w:kern w:val="2"/>
       <w:sz w:val="24"/>
       <w:szCs w:val="24"/>
-      <w:lang w:val="es-ES" w:eastAsia="zh-CN" w:bidi="hi-IN"/>
+      <w:lang w:val="en-US" w:eastAsia="zh-CN" w:bidi="hi-IN"/>
     </w:rPr>
   </w:style>
   <w:style w:type="character" w:styleId="nfasis">
@@ -1199,8 +1199,8 @@
       <w:suppressLineNumbers/>
       <w:tabs>
         <w:tab w:val="clear" w:pos="709"/>
-        <w:tab w:val="center" w:pos="4819" w:leader="none"/>
-        <w:tab w:val="right" w:pos="9638" w:leader="none"/>
+        <w:tab w:val="center" w:pos="4986" w:leader="none"/>
+        <w:tab w:val="right" w:pos="9972" w:leader="none"/>
       </w:tabs>
     </w:pPr>
     <w:rPr/>

</xml_diff>